<commit_message>
Se corrio unidad fallecido con prop y lic
</commit_message>
<xml_diff>
--- a/plantillas/word_informe_un_vehiculo_fallecido.docx
+++ b/plantillas/word_informe_un_vehiculo_fallecido.docx
@@ -3813,178 +3813,7 @@
         </w:rPr>
       </w:pPr>
       <w:r>
-        <w:rPr>
-          <w:color w:val="FF0000"/>
-          <w:sz w:val="24"/>
-          <w:szCs w:val="24"/>
-          <w:lang w:val="es-ES_tradnl"/>
-        </w:rPr>
-        <w:t xml:space="preserve">Fue sometido a la pericia de Dosaje Etílico, por personal médico de la unidad desconcentrada de dosaje etílico, el </w:t>
-      </w:r>
-      <w:r>
-        <w:t>${v1_dosaje_fecha}</w:t>
-      </w:r>
-      <w:r>
-        <w:rPr>
-          <w:color w:val="FF0000"/>
-          <w:sz w:val="24"/>
-          <w:szCs w:val="24"/>
-          <w:lang w:val="es-ES_tradnl"/>
-        </w:rPr>
-        <w:fldChar w:fldCharType="begin"/>
-      </w:r>
-      <w:r>
-        <w:rPr>
-          <w:color w:val="FF0000"/>
-          <w:sz w:val="24"/>
-          <w:szCs w:val="24"/>
-          <w:lang w:val="es-ES_tradnl"/>
-        </w:rPr>
-        <w:instrText xml:space="preserve"> MERGEFIELD "FECHA_DOSAJE_CONDUCTOR1" \@ "DDMMMYYYY"\* Upper </w:instrText>
-      </w:r>
-      <w:r>
-        <w:rPr>
-          <w:color w:val="FF0000"/>
-          <w:sz w:val="24"/>
-          <w:szCs w:val="24"/>
-          <w:lang w:val="es-ES_tradnl"/>
-        </w:rPr>
-        <w:fldChar w:fldCharType="end"/>
-      </w:r>
-      <w:r>
-        <w:rPr>
-          <w:color w:val="FF0000"/>
-          <w:sz w:val="24"/>
-          <w:szCs w:val="24"/>
-          <w:lang w:val="es-ES_tradnl"/>
-        </w:rPr>
-        <w:t xml:space="preserve">, donde expidieron el Certificado N° </w:t>
-      </w:r>
-      <w:r>
-        <w:t>${v1_dosaje_numero}</w:t>
-      </w:r>
-      <w:r>
-        <w:rPr>
-          <w:color w:val="FF0000"/>
-          <w:sz w:val="24"/>
-          <w:szCs w:val="24"/>
-          <w:lang w:val="es-ES_tradnl"/>
-        </w:rPr>
-        <w:fldChar w:fldCharType="begin"/>
-      </w:r>
-      <w:r>
-        <w:rPr>
-          <w:color w:val="FF0000"/>
-          <w:sz w:val="24"/>
-          <w:szCs w:val="24"/>
-          <w:lang w:val="es-ES_tradnl"/>
-        </w:rPr>
-        <w:instrText xml:space="preserve"> MERGEFIELD "DOSAJE_NRO_CONDUCTOR1" </w:instrText>
-      </w:r>
-      <w:r>
-        <w:rPr>
-          <w:color w:val="FF0000"/>
-          <w:sz w:val="24"/>
-          <w:szCs w:val="24"/>
-          <w:lang w:val="es-ES_tradnl"/>
-        </w:rPr>
-        <w:fldChar w:fldCharType="end"/>
-      </w:r>
-      <w:r>
-        <w:rPr>
-          <w:color w:val="FF0000"/>
-          <w:sz w:val="24"/>
-          <w:szCs w:val="24"/>
-          <w:lang w:val="es-ES_tradnl"/>
-        </w:rPr>
-        <w:t xml:space="preserve"> (registro Nº </w:t>
-      </w:r>
-      <w:r>
-        <w:t>${v1_dosaje_registro}</w:t>
-      </w:r>
-      <w:r>
-        <w:rPr>
-          <w:color w:val="FF0000"/>
-          <w:sz w:val="24"/>
-          <w:szCs w:val="24"/>
-          <w:lang w:val="es-ES_tradnl"/>
-        </w:rPr>
-        <w:fldChar w:fldCharType="begin"/>
-      </w:r>
-      <w:r>
-        <w:rPr>
-          <w:color w:val="FF0000"/>
-          <w:sz w:val="24"/>
-          <w:szCs w:val="24"/>
-          <w:lang w:val="es-ES_tradnl"/>
-        </w:rPr>
-        <w:instrText xml:space="preserve"> MERGEFIELD "REGISTRO_NRO_CONDUCTOR1" </w:instrText>
-      </w:r>
-      <w:r>
-        <w:rPr>
-          <w:color w:val="FF0000"/>
-          <w:sz w:val="24"/>
-          <w:szCs w:val="24"/>
-          <w:lang w:val="es-ES_tradnl"/>
-        </w:rPr>
-        <w:fldChar w:fldCharType="end"/>
-      </w:r>
-      <w:r>
-        <w:rPr>
-          <w:color w:val="FF0000"/>
-          <w:sz w:val="24"/>
-          <w:szCs w:val="24"/>
-          <w:lang w:val="es-ES_tradnl"/>
-        </w:rPr>
-        <w:t xml:space="preserve">), con el resultado </w:t>
-      </w:r>
-      <w:r>
-        <w:rPr>
-          <w:color w:val="FF0000"/>
-          <w:sz w:val="24"/>
-          <w:szCs w:val="24"/>
-          <w:lang w:val="es-ES_tradnl"/>
-        </w:rPr>
-        <w:t xml:space="preserve">cualitativo </w:t>
-      </w:r>
-      <w:r>
-        <w:t>${v1_dosaje_resultado_cual} y cuantitativo ${v1_dosaje_lectura_cuant} (${v1_dosaje_resultado_cuant})</w:t>
-      </w:r>
-      <w:r>
-        <w:rPr>
-          <w:color w:val="FF0000"/>
-          <w:sz w:val="24"/>
-          <w:szCs w:val="24"/>
-          <w:lang w:val="es-ES_tradnl"/>
-        </w:rPr>
-        <w:fldChar w:fldCharType="begin"/>
-      </w:r>
-      <w:r>
-        <w:rPr>
-          <w:color w:val="FF0000"/>
-          <w:sz w:val="24"/>
-          <w:szCs w:val="24"/>
-          <w:lang w:val="es-ES_tradnl"/>
-        </w:rPr>
-        <w:instrText xml:space="preserve"> MERGEFIELD "RESULTADO_DOSAJE_CONDUCTOR1" </w:instrText>
-      </w:r>
-      <w:r>
-        <w:rPr>
-          <w:color w:val="FF0000"/>
-          <w:sz w:val="24"/>
-          <w:szCs w:val="24"/>
-          <w:lang w:val="es-ES_tradnl"/>
-        </w:rPr>
-        <w:fldChar w:fldCharType="end"/>
-      </w:r>
-      <w:r>
-        <w:rPr>
-          <w:color w:val="FF0000"/>
-          <w:sz w:val="24"/>
-          <w:szCs w:val="24"/>
-          <w:lang w:val="es-ES_tradnl"/>
-        </w:rPr>
-        <w:t>.</w:t>
+        <w:t xml:space="preserve">Fue sometido a la pericia de Dosaje Etilico, por personal medico de la unidad desconcentrada de dosaje etilico, el ${v1_dosaje_fecha} a horas ${v1_dosaje_hora}, donde expidieron el Certificado Nro. ${v1_dosaje_numero} (registro Nro. ${v1_dosaje_registro}), con resultado cualitativo ${v1_dosaje_resultado_cual}, resultado cuantitativo ${v1_dosaje_resultado_cuant} y lectura ${v1_dosaje_lectura_cuant}. Observaciones: ${v1_dosaje_observaciones}.</w:t>
       </w:r>
     </w:p>
     <w:p>
@@ -4045,145 +3874,7 @@
         </w:rPr>
       </w:pPr>
       <w:r>
-        <w:rPr>
-          <w:color w:val="FF0000"/>
-          <w:sz w:val="24"/>
-          <w:szCs w:val="24"/>
-          <w:lang w:val="es-ES_tradnl"/>
-        </w:rPr>
-        <w:t xml:space="preserve">Revisado en el sistema de licencia de conducir del MTC </w:t>
-      </w:r>
-      <w:hyperlink r:id="rId9" w:history="1">
-        <w:r>
-          <w:rPr>
-            <w:rStyle w:val="Hipervnculo"/>
-            <w:color w:val="FF0000"/>
-            <w:sz w:val="24"/>
-            <w:szCs w:val="24"/>
-            <w:lang w:val="es-ES_tradnl"/>
-          </w:rPr>
-          <w:t>https://licencias-tramite.mtc.gob.pe/frmLB_Consulta.aspx</w:t>
-        </w:r>
-      </w:hyperlink>
-      <w:r>
-        <w:rPr>
-          <w:color w:val="FF0000"/>
-          <w:sz w:val="24"/>
-          <w:szCs w:val="24"/>
-          <w:lang w:val="es-ES_tradnl"/>
-        </w:rPr>
-        <w:t>, se obtuvo como información que a la consulta a la persona de,</w:t>
-      </w:r>
-      <w:r>
-        <w:t xml:space="preserve"> </w:t>
-      </w:r>
-      <w:r>
-        <w:t>${v1_cond_nombre}</w:t>
-      </w:r>
-      <w:r>
-        <w:rPr>
-          <w:color w:val="FF0000"/>
-          <w:sz w:val="24"/>
-          <w:szCs w:val="24"/>
-          <w:lang w:val="es-ES_tradnl"/>
-        </w:rPr>
-        <w:t xml:space="preserve"> “</w:t>
-      </w:r>
-      <w:r>
-        <w:rPr>
-          <w:color w:val="FF0000"/>
-          <w:sz w:val="24"/>
-          <w:szCs w:val="24"/>
-          <w:lang w:val="es-ES_tradnl"/>
-        </w:rPr>
-        <w:t>Si</w:t>
-      </w:r>
-      <w:r>
-        <w:rPr>
-          <w:color w:val="FF0000"/>
-          <w:sz w:val="24"/>
-          <w:szCs w:val="24"/>
-          <w:lang w:val="es-ES_tradnl"/>
-        </w:rPr>
-        <w:t>” registra licencia de conducir expedida por el Ministerio de Transporte y Comunicaciones, N°</w:t>
-      </w:r>
-      <w:r>
-        <w:rPr>
-          <w:color w:val="FF0000"/>
-          <w:sz w:val="24"/>
-          <w:szCs w:val="24"/>
-          <w:lang w:val="es-ES_tradnl"/>
-        </w:rPr>
-        <w:t xml:space="preserve"> </w:t>
-      </w:r>
-      <w:r>
-        <w:t>${v1_lc_numero}</w:t>
-      </w:r>
-      <w:r>
-        <w:rPr>
-          <w:color w:val="FF0000"/>
-          <w:sz w:val="24"/>
-          <w:szCs w:val="24"/>
-          <w:lang w:val="es-ES_tradnl"/>
-        </w:rPr>
-        <w:t xml:space="preserve">, en la clase </w:t>
-      </w:r>
-      <w:r>
-        <w:t xml:space="preserve">${v1_lc_clase} </w:t>
-      </w:r>
-      <w:r>
-        <w:rPr>
-          <w:color w:val="FF0000"/>
-          <w:sz w:val="24"/>
-          <w:szCs w:val="24"/>
-          <w:lang w:val="es-ES_tradnl"/>
-        </w:rPr>
-        <w:t xml:space="preserve">categoría </w:t>
-      </w:r>
-      <w:r>
-        <w:t xml:space="preserve">${v1_lc_categoria} </w:t>
-      </w:r>
-      <w:r>
-        <w:rPr>
-          <w:color w:val="FF0000"/>
-          <w:sz w:val="24"/>
-          <w:szCs w:val="24"/>
-          <w:lang w:val="es-ES_tradnl"/>
-        </w:rPr>
-        <w:t xml:space="preserve">vigente desde </w:t>
-      </w:r>
-      <w:r>
-        <w:t>${v1_lc_vigente_desde}</w:t>
-      </w:r>
-      <w:r>
-        <w:rPr>
-          <w:color w:val="FF0000"/>
-          <w:sz w:val="24"/>
-          <w:szCs w:val="24"/>
-          <w:lang w:val="es-ES_tradnl"/>
-        </w:rPr>
-        <w:t xml:space="preserve"> hasta el</w:t>
-      </w:r>
-      <w:r>
-        <w:rPr>
-          <w:color w:val="FF0000"/>
-          <w:sz w:val="24"/>
-          <w:szCs w:val="24"/>
-          <w:lang w:val="es-ES_tradnl"/>
-        </w:rPr>
-        <w:t xml:space="preserve"> </w:t>
-      </w:r>
-      <w:r>
-        <w:t>${v1_lc_vigente_hasta}</w:t>
-      </w:r>
-      <w:r>
-        <w:rPr>
-          <w:color w:val="FF0000"/>
-          <w:sz w:val="24"/>
-          <w:szCs w:val="24"/>
-          <w:lang w:val="es-ES_tradnl"/>
-        </w:rPr>
-        <w:t>.</w:t>
+        <w:t xml:space="preserve">Revisado en el sistema de licencia de conducir del MTC https://licencias-tramite.mtc.gob.pe/frmLB_Consulta.aspx, se obtuvo como informacion que la persona de ${v1_cond_nombre} registra licencia de conducir Nro. ${v1_lc_numero}, clase ${v1_lc_clase}, categoria ${v1_lc_categoria}, expedida por ${v1_lc_expedido_por}, vigente desde ${v1_lc_vigente_desde} hasta ${v1_lc_vigente_hasta}. Restricciones: ${v1_lc_restricciones}.</w:t>
       </w:r>
     </w:p>
     <w:p>
@@ -4273,7 +3964,13 @@
         <w:t xml:space="preserve"> </w:t>
       </w:r>
       <w:r>
-        <w:t>${v1_cond_nombre}</w:t>
+        <w:t>${v1_</w:t>
+      </w:r>
+      <w:r>
+        <w:t>fall</w:t>
+      </w:r>
+      <w:r>
+        <w:t>_nombre}</w:t>
       </w:r>
       <w:r>
         <w:rPr>
@@ -4886,263 +4583,7 @@
         </w:rPr>
       </w:pPr>
       <w:r>
-        <w:t>${v1_prop_nombre}, con RUC N° ${v1_prop_ruc}, domicilio representado por ${v1_prop_nat_nombre}</w:t>
-      </w:r>
-      <w:r>
-        <w:rPr>
-          <w:color w:val="FF0000"/>
-          <w:sz w:val="24"/>
-          <w:szCs w:val="24"/>
-          <w:lang w:val="es-ES_tradnl"/>
-        </w:rPr>
-        <w:t xml:space="preserve">, de </w:t>
-      </w:r>
-      <w:proofErr w:type="spellStart"/>
-      <w:r>
-        <w:rPr>
-          <w:color w:val="FF0000"/>
-          <w:sz w:val="24"/>
-          <w:szCs w:val="24"/>
-          <w:lang w:val="es-ES_tradnl"/>
-        </w:rPr>
-        <w:t>xx</w:t>
-      </w:r>
-      <w:proofErr w:type="spellEnd"/>
-      <w:r>
-        <w:rPr>
-          <w:color w:val="FF0000"/>
-          <w:sz w:val="24"/>
-          <w:szCs w:val="24"/>
-          <w:lang w:val="es-ES_tradnl"/>
-        </w:rPr>
-        <w:t xml:space="preserve"> años, natural de</w:t>
-      </w:r>
-      <w:r>
-        <w:rPr>
-          <w:color w:val="FF0000"/>
-          <w:sz w:val="24"/>
-          <w:szCs w:val="24"/>
-          <w:lang w:val="es-ES_tradnl"/>
-        </w:rPr>
-        <w:t xml:space="preserve"> </w:t>
-      </w:r>
-      <w:proofErr w:type="spellStart"/>
-      <w:r>
-        <w:rPr>
-          <w:color w:val="FF0000"/>
-          <w:sz w:val="24"/>
-          <w:szCs w:val="24"/>
-          <w:lang w:val="es-ES_tradnl"/>
-        </w:rPr>
-        <w:t>xxxx</w:t>
-      </w:r>
-      <w:proofErr w:type="spellEnd"/>
-      <w:r>
-        <w:rPr>
-          <w:color w:val="FF0000"/>
-          <w:sz w:val="24"/>
-          <w:szCs w:val="24"/>
-          <w:lang w:val="es-ES_tradnl"/>
-        </w:rPr>
-        <w:t>, estado civil</w:t>
-      </w:r>
-      <w:r>
-        <w:rPr>
-          <w:color w:val="FF0000"/>
-          <w:sz w:val="24"/>
-          <w:szCs w:val="24"/>
-          <w:lang w:val="es-ES_tradnl"/>
-        </w:rPr>
-        <w:t xml:space="preserve"> </w:t>
-      </w:r>
-      <w:proofErr w:type="spellStart"/>
-      <w:r>
-        <w:rPr>
-          <w:color w:val="FF0000"/>
-          <w:sz w:val="24"/>
-          <w:szCs w:val="24"/>
-          <w:lang w:val="es-ES_tradnl"/>
-        </w:rPr>
-        <w:t>xxxx</w:t>
-      </w:r>
-      <w:proofErr w:type="spellEnd"/>
-      <w:r>
-        <w:rPr>
-          <w:color w:val="FF0000"/>
-          <w:sz w:val="24"/>
-          <w:szCs w:val="24"/>
-          <w:lang w:val="es-ES_tradnl"/>
-        </w:rPr>
-        <w:t>, de ocupación</w:t>
-      </w:r>
-      <w:r>
-        <w:rPr>
-          <w:color w:val="FF0000"/>
-          <w:sz w:val="24"/>
-          <w:szCs w:val="24"/>
-          <w:lang w:val="es-ES_tradnl"/>
-        </w:rPr>
-        <w:t xml:space="preserve"> </w:t>
-      </w:r>
-      <w:proofErr w:type="spellStart"/>
-      <w:r>
-        <w:rPr>
-          <w:color w:val="FF0000"/>
-          <w:sz w:val="24"/>
-          <w:szCs w:val="24"/>
-          <w:lang w:val="es-ES_tradnl"/>
-        </w:rPr>
-        <w:t>xxx</w:t>
-      </w:r>
-      <w:proofErr w:type="spellEnd"/>
-      <w:r>
-        <w:rPr>
-          <w:color w:val="FF0000"/>
-          <w:sz w:val="24"/>
-          <w:szCs w:val="24"/>
-          <w:lang w:val="es-ES_tradnl"/>
-        </w:rPr>
-        <w:t>, identificado con DNI N°</w:t>
-      </w:r>
-      <w:r>
-        <w:rPr>
-          <w:color w:val="FF0000"/>
-          <w:sz w:val="24"/>
-          <w:szCs w:val="24"/>
-          <w:lang w:val="es-ES_tradnl"/>
-        </w:rPr>
-        <w:t xml:space="preserve"> </w:t>
-      </w:r>
-      <w:r>
-        <w:t>${v1_prop_rep_doc}</w:t>
-      </w:r>
-      <w:r>
-        <w:rPr>
-          <w:color w:val="FF0000"/>
-          <w:sz w:val="24"/>
-          <w:szCs w:val="24"/>
-          <w:lang w:val="es-ES_tradnl"/>
-        </w:rPr>
-        <w:t>, domiciliado en</w:t>
-      </w:r>
-      <w:r>
-        <w:rPr>
-          <w:color w:val="FF0000"/>
-          <w:sz w:val="24"/>
-          <w:szCs w:val="24"/>
-          <w:lang w:val="es-ES_tradnl"/>
-        </w:rPr>
-        <w:t xml:space="preserve"> </w:t>
-      </w:r>
-      <w:r>
-        <w:t>${v1_prop_rep_domicilio}</w:t>
-      </w:r>
-      <w:r>
-        <w:rPr>
-          <w:color w:val="FF0000"/>
-          <w:sz w:val="24"/>
-          <w:szCs w:val="24"/>
-          <w:lang w:val="es-ES_tradnl"/>
-        </w:rPr>
-        <w:t xml:space="preserve">, celular N° </w:t>
-      </w:r>
-      <w:r>
-        <w:t>${v1_prop_rep_celular}</w:t>
-      </w:r>
-      <w:r>
-        <w:rPr>
-          <w:color w:val="FF0000"/>
-          <w:sz w:val="24"/>
-          <w:szCs w:val="24"/>
-          <w:lang w:val="es-ES_tradnl"/>
-        </w:rPr>
-        <w:fldChar w:fldCharType="begin"/>
-      </w:r>
-      <w:r>
-        <w:rPr>
-          <w:color w:val="FF0000"/>
-          <w:sz w:val="24"/>
-          <w:szCs w:val="24"/>
-          <w:lang w:val="es-ES_tradnl"/>
-        </w:rPr>
-        <w:instrText xml:space="preserve"> MERGEFIELD "TELEFONO_PROP1" </w:instrText>
-      </w:r>
-      <w:r>
-        <w:rPr>
-          <w:color w:val="FF0000"/>
-          <w:sz w:val="24"/>
-          <w:szCs w:val="24"/>
-          <w:lang w:val="es-ES_tradnl"/>
-        </w:rPr>
-        <w:fldChar w:fldCharType="end"/>
-      </w:r>
-      <w:r>
-        <w:rPr>
-          <w:color w:val="FF0000"/>
-          <w:sz w:val="24"/>
-          <w:szCs w:val="24"/>
-          <w:lang w:val="es-ES_tradnl"/>
-        </w:rPr>
-        <w:t>, correo electrónico</w:t>
-      </w:r>
-      <w:r>
-        <w:rPr>
-          <w:color w:val="FF0000"/>
-          <w:sz w:val="24"/>
-          <w:szCs w:val="24"/>
-          <w:lang w:val="es-ES_tradnl"/>
-        </w:rPr>
-        <w:t xml:space="preserve"> </w:t>
-      </w:r>
-      <w:r>
-        <w:t>${v1_prop_rep_email}</w:t>
-      </w:r>
-      <w:r>
-        <w:rPr>
-          <w:color w:val="FF0000"/>
-          <w:sz w:val="24"/>
-          <w:szCs w:val="24"/>
-        </w:rPr>
-        <w:t xml:space="preserve">, acompañado de su abogado defensor </w:t>
-      </w:r>
-      <w:r>
-        <w:t>${v1_prop_abog_nombre}, con registro ${v1_prop_abog_colegiatura} ${v1_prop_abog_registro}</w:t>
-      </w:r>
-      <w:r>
-        <w:rPr>
-          <w:color w:val="FF0000"/>
-          <w:sz w:val="24"/>
-          <w:szCs w:val="24"/>
-          <w:lang w:val="es-ES_tradnl"/>
-        </w:rPr>
-        <w:fldChar w:fldCharType="begin"/>
-      </w:r>
-      <w:r>
-        <w:rPr>
-          <w:color w:val="FF0000"/>
-          <w:sz w:val="24"/>
-          <w:szCs w:val="24"/>
-          <w:lang w:val="es-ES_tradnl"/>
-        </w:rPr>
-        <w:instrText xml:space="preserve"> MERGEFIELD "EMAIL_PROP1" \lower</w:instrText>
-      </w:r>
-      <w:r>
-        <w:rPr>
-          <w:color w:val="FF0000"/>
-          <w:sz w:val="24"/>
-          <w:szCs w:val="24"/>
-          <w:lang w:val="es-ES_tradnl"/>
-        </w:rPr>
-        <w:fldChar w:fldCharType="end"/>
-      </w:r>
-      <w:r>
-        <w:rPr>
-          <w:color w:val="FF0000"/>
-          <w:sz w:val="24"/>
-          <w:szCs w:val="24"/>
-          <w:lang w:val="es-ES_tradnl"/>
-        </w:rPr>
-        <w:t>.</w:t>
+        <w:t xml:space="preserve">Propietario: ${v1_prop_nombre}, tipo ${v1_prop_tipo}, identificado con ${v1_prop_doc}, propietario natural ${v1_prop_nat_nombre} (${v1_prop_nat_doc}), domicilio ${v1_prop_nat_domicilio}, RUC ${v1_prop_ruc}, razon social ${v1_prop_razon_social}, domicilio fiscal ${v1_prop_domicilio_fiscal}. Representante legal: ${v1_prop_rep_nombre}, identificado con ${v1_prop_rep_doc}, domiciliado en ${v1_prop_rep_domicilio}, celular Nro. ${v1_prop_rep_celular}, correo electronico ${v1_prop_rep_email}. Abogado defensor: ${v1_prop_abog_nombre}, colegiatura ${v1_prop_abog_colegiatura}, registro ${v1_prop_abog_registro}.</w:t>
       </w:r>
     </w:p>
     <w:p>

</xml_diff>